<commit_message>
Contratos: ordenar por más reciente y reflejar horas de sala de juntas
- /contratos ahora ordena por created_at descendente (antes era por
  fecha_vencimiento, que no refleja cuándo se creó el contrato) — el
  más reciente queda arriba en ambas listas (pendientes y todos).
- Nuevo marcador {{HORAS_SALA_JUNTAS}} en las 6 plantillas reales que
  traían la frase fija "(4 hrs al mes)"/"(0 hrs al mes)" en Servicios
  Incluidos — ahora refleja las horas reales del paquete contratado
  (paquetes.incluye_horas_sala_juntas). También se guarda en
  contratos.horas_sala_juntas, igual que ya hace CotizarForm.tsx.

Co-Authored-By: Claude Sonnet 5 <noreply@anthropic.com>
</commit_message>
<xml_diff>
--- a/public/plantillas-contrato/BosquesCoworkingFisicaConDeposito.docx
+++ b/public/plantillas-contrato/BosquesCoworkingFisicaConDeposito.docx
@@ -2627,27 +2627,9 @@
           <w:bCs w:val="1"/>
           <w:sz w:val="22"/>
           <w:szCs w:val="22"/>
-          <w:highlight w:val="yellow"/>
-          <w:rtl w:val="0"/>
-        </w:rPr>
-        <w:t xml:space="preserve">4</w:t>
-      </w:r>
-      <w:r>
-        <w:rPr>
-          <w:sz w:val="22"/>
-          <w:szCs w:val="22"/>
-          <w:highlight w:val="yellow"/>
-          <w:rtl w:val="0"/>
-        </w:rPr>
-        <w:t xml:space="preserve"> </w:t>
-      </w:r>
-      <w:r>
-        <w:rPr>
-          <w:sz w:val="22"/>
-          <w:szCs w:val="22"/>
-          <w:rtl w:val="0"/>
-        </w:rPr>
-        <w:t xml:space="preserve">hrs al mes)</w:t>
+          <w:rtl w:val="0"/>
+        </w:rPr>
+        <w:t xml:space="preserve">{{HORAS_SALA_JUNTAS}} hrs al mes)</w:t>
       </w:r>
     </w:p>
     <w:p>

</xml_diff>